<commit_message>
Ping Pong Tanks: GitHub Desktop -kuvaohje viikolle 36
Viikon 36 resursseissa, työvaiheen 3 apuosassa ja Työkalut-osion Git-
kohdassa on linkki englanninkieliseen kuvaohjeeseen. Repositoryn luonti
neuvotaan GitHub Desktopin reitillä B; komentorivin Git käy edelleen.
Viikon 44 haara luodaan Desktopissa Current Branch → New Branch.
Osatehtävien määrä ja järjestys pysyivät, joten opiskelijan rastit
eivät siirry. Työpaketti tuotettu uudelleen resurssilinkkeineen.

Co-Authored-By: Claude Opus 5.5 <noreply@anthropic.com>
</commit_message>
<xml_diff>
--- a/downloads/pingpongtanks-tyopaketti.docx
+++ b/downloads/pingpongtanks-tyopaketti.docx
@@ -4,7 +4,7 @@
   <w:body>
     <w:p>
       <w:pPr>
-        <w:spacing w:before="2400" w:after="200"/>
+        <w:spacing w:after="200" w:before="2400"/>
         <w:jc w:val="center"/>
       </w:pPr>
       <w:r>
@@ -110,7 +110,7 @@
     <w:p>
       <w:pPr>
         <w:pStyle w:val="Heading1"/>
-        <w:spacing w:before="320" w:after="160"/>
+        <w:spacing w:after="160" w:before="320"/>
       </w:pPr>
       <w:r>
         <w:rPr>
@@ -188,7 +188,7 @@
     <w:p>
       <w:pPr>
         <w:pStyle w:val="Heading2"/>
-        <w:spacing w:before="260" w:after="120"/>
+        <w:spacing w:after="120" w:before="260"/>
       </w:pPr>
       <w:r>
         <w:rPr>
@@ -330,7 +330,7 @@
     <w:p>
       <w:pPr>
         <w:pStyle w:val="Heading1"/>
-        <w:spacing w:before="320" w:after="160"/>
+        <w:spacing w:after="160" w:before="320"/>
       </w:pPr>
       <w:r>
         <w:rPr>
@@ -1834,7 +1834,7 @@
     <w:p>
       <w:pPr>
         <w:pStyle w:val="Heading1"/>
-        <w:spacing w:before="320" w:after="160"/>
+        <w:spacing w:after="160" w:before="320"/>
       </w:pPr>
       <w:r>
         <w:rPr>
@@ -1848,7 +1848,7 @@
     <w:p>
       <w:pPr>
         <w:pStyle w:val="Heading2"/>
-        <w:spacing w:before="260" w:after="120"/>
+        <w:spacing w:after="120" w:before="260"/>
       </w:pPr>
       <w:r>
         <w:rPr>
@@ -1884,6 +1884,50 @@
         </w:rPr>
         <w:t xml:space="preserve">Week goal: Anyone who opens your public repository can see what gets built first: the P0 issues in the milestone "MVP 4 Dec".</w:t>
       </w:r>
+    </w:p>
+    <w:p>
+      <w:pPr>
+        <w:spacing w:after="80"/>
+      </w:pPr>
+      <w:r>
+        <w:rPr>
+          <w:sz w:val="19"/>
+          <w:szCs w:val="19"/>
+        </w:rPr>
+        <w:t xml:space="preserve">Kuvaohje tai materiaali: </w:t>
+      </w:r>
+      <w:hyperlink w:history="1" r:id="rIdg7ydqckcqfm9egnff6lae">
+        <w:r>
+          <w:rPr>
+            <w:rStyle w:val="Hyperlink"/>
+            <w:sz w:val="19"/>
+            <w:szCs w:val="19"/>
+          </w:rPr>
+          <w:t xml:space="preserve">Open the implementation plan</w:t>
+        </w:r>
+      </w:hyperlink>
+    </w:p>
+    <w:p>
+      <w:pPr>
+        <w:spacing w:after="80"/>
+      </w:pPr>
+      <w:r>
+        <w:rPr>
+          <w:sz w:val="19"/>
+          <w:szCs w:val="19"/>
+        </w:rPr>
+        <w:t xml:space="preserve">Kuvaohje tai materiaali: </w:t>
+      </w:r>
+      <w:hyperlink w:history="1" r:id="rIdaznjoo6t-cpqk1mxhz4sw">
+        <w:r>
+          <w:rPr>
+            <w:rStyle w:val="Hyperlink"/>
+            <w:sz w:val="19"/>
+            <w:szCs w:val="19"/>
+          </w:rPr>
+          <w:t xml:space="preserve">GitHub Desktop: picture guide without Git commands</w:t>
+        </w:r>
+      </w:hyperlink>
     </w:p>
     <w:p>
       <w:pPr>
@@ -2123,20 +2167,20 @@
           <w:sz w:val="19"/>
           <w:szCs w:val="19"/>
         </w:rPr>
-        <w:t xml:space="preserve">☐  2. Add the Unity .gitignore. Take Unity.gitignore from GitHub's gitignore collection, so that Library/, Temp/ and build folders stay out of Git.</w:t>
-      </w:r>
-    </w:p>
-    <w:p>
-      <w:pPr>
-        <w:spacing w:after="40" w:before="0"/>
-        <w:ind w:left="360"/>
-      </w:pPr>
-      <w:r>
-        <w:rPr>
-          <w:sz w:val="19"/>
-          <w:szCs w:val="19"/>
-        </w:rPr>
-        <w:t xml:space="preserve">☐  3. Create the public repository. Run git init, make the first commit, create a public GitHub repository and push. The README says in one paragraph which game, who builds it and by when.</w:t>
+        <w:t xml:space="preserve">☐  2. Add the Unity .gitignore. Save GitHub's Unity.gitignore in the project folder as .gitignore, so that Library/, Temp/ and build folders stay out of Git. Step 4 of the picture guide shows how.</w:t>
+      </w:r>
+    </w:p>
+    <w:p>
+      <w:pPr>
+        <w:spacing w:after="40" w:before="0"/>
+        <w:ind w:left="360"/>
+      </w:pPr>
+      <w:r>
+        <w:rPr>
+          <w:sz w:val="19"/>
+          <w:szCs w:val="19"/>
+        </w:rPr>
+        <w:t xml:space="preserve">☐  3. Create the public repository. Write the README paragraph: which game, who builds it, by when. Add the folder to GitHub Desktop (picture guide route B), commit, choose Publish repository and untick Keep this code private.</w:t>
       </w:r>
     </w:p>
     <w:p>
@@ -2331,7 +2375,7 @@
     <w:p>
       <w:pPr>
         <w:pStyle w:val="Heading2"/>
-        <w:spacing w:before="260" w:after="120"/>
+        <w:spacing w:after="120" w:before="260"/>
       </w:pPr>
       <w:r>
         <w:rPr>
@@ -2694,7 +2738,7 @@
     <w:p>
       <w:pPr>
         <w:pStyle w:val="Heading2"/>
-        <w:spacing w:before="260" w:after="120"/>
+        <w:spacing w:after="120" w:before="260"/>
       </w:pPr>
       <w:r>
         <w:rPr>
@@ -3112,7 +3156,7 @@
     <w:p>
       <w:pPr>
         <w:pStyle w:val="Heading2"/>
-        <w:spacing w:before="260" w:after="120"/>
+        <w:spacing w:after="120" w:before="260"/>
       </w:pPr>
       <w:r>
         <w:rPr>
@@ -3462,7 +3506,7 @@
     <w:p>
       <w:pPr>
         <w:pStyle w:val="Heading1"/>
-        <w:spacing w:before="320" w:after="160"/>
+        <w:spacing w:after="160" w:before="320"/>
       </w:pPr>
       <w:r>
         <w:rPr>
@@ -3476,7 +3520,7 @@
     <w:p>
       <w:pPr>
         <w:pStyle w:val="Heading2"/>
-        <w:spacing w:before="260" w:after="120"/>
+        <w:spacing w:after="120" w:before="260"/>
       </w:pPr>
       <w:r>
         <w:rPr>
@@ -3946,7 +3990,7 @@
     <w:p>
       <w:pPr>
         <w:pStyle w:val="Heading2"/>
-        <w:spacing w:before="260" w:after="120"/>
+        <w:spacing w:after="120" w:before="260"/>
       </w:pPr>
       <w:r>
         <w:rPr>
@@ -4309,7 +4353,7 @@
     <w:p>
       <w:pPr>
         <w:pStyle w:val="Heading2"/>
-        <w:spacing w:before="260" w:after="120"/>
+        <w:spacing w:after="120" w:before="260"/>
       </w:pPr>
       <w:r>
         <w:rPr>
@@ -4329,12 +4373,13 @@
           <w:sz w:val="21"/>
           <w:szCs w:val="21"/>
         </w:rPr>
+        <w:t xml:space="preserve"/>
       </w:r>
     </w:p>
     <w:p>
       <w:pPr>
         <w:pStyle w:val="Heading2"/>
-        <w:spacing w:before="260" w:after="120"/>
+        <w:spacing w:after="120" w:before="260"/>
       </w:pPr>
       <w:r>
         <w:rPr>
@@ -4697,7 +4742,7 @@
     <w:p>
       <w:pPr>
         <w:pStyle w:val="Heading1"/>
-        <w:spacing w:before="320" w:after="160"/>
+        <w:spacing w:after="160" w:before="320"/>
       </w:pPr>
       <w:r>
         <w:rPr>
@@ -4711,7 +4756,7 @@
     <w:p>
       <w:pPr>
         <w:pStyle w:val="Heading2"/>
-        <w:spacing w:before="260" w:after="120"/>
+        <w:spacing w:after="120" w:before="260"/>
       </w:pPr>
       <w:r>
         <w:rPr>
@@ -4772,7 +4817,7 @@
           <w:sz w:val="19"/>
           <w:szCs w:val="19"/>
         </w:rPr>
-        <w:t xml:space="preserve">☐  1. Create a branch. Run git checkout -b fix/review-week43, so that main keeps working while you make the change.</w:t>
+        <w:t xml:space="preserve">☐  1. Create a branch. Create the branch fix/review-week43: in GitHub Desktop choose Current Branch → New Branch, or run git checkout -b. Main keeps working while you make the change.</w:t>
       </w:r>
     </w:p>
     <w:p>
@@ -5142,7 +5187,7 @@
     <w:p>
       <w:pPr>
         <w:pStyle w:val="Heading2"/>
-        <w:spacing w:before="260" w:after="120"/>
+        <w:spacing w:after="120" w:before="260"/>
       </w:pPr>
       <w:r>
         <w:rPr>
@@ -5573,7 +5618,7 @@
     <w:p>
       <w:pPr>
         <w:pStyle w:val="Heading2"/>
-        <w:spacing w:before="260" w:after="120"/>
+        <w:spacing w:after="120" w:before="260"/>
       </w:pPr>
       <w:r>
         <w:rPr>
@@ -5936,7 +5981,7 @@
     <w:p>
       <w:pPr>
         <w:pStyle w:val="Heading1"/>
-        <w:spacing w:before="320" w:after="160"/>
+        <w:spacing w:after="160" w:before="320"/>
       </w:pPr>
       <w:r>
         <w:rPr>
@@ -5950,7 +5995,7 @@
     <w:p>
       <w:pPr>
         <w:pStyle w:val="Heading2"/>
-        <w:spacing w:before="260" w:after="120"/>
+        <w:spacing w:after="120" w:before="260"/>
       </w:pPr>
       <w:r>
         <w:rPr>
@@ -6407,7 +6452,7 @@
     <w:p>
       <w:pPr>
         <w:pStyle w:val="Heading2"/>
-        <w:spacing w:before="260" w:after="120"/>
+        <w:spacing w:after="120" w:before="260"/>
       </w:pPr>
       <w:r>
         <w:rPr>
@@ -6744,7 +6789,7 @@
     <w:p>
       <w:pPr>
         <w:pStyle w:val="Heading2"/>
-        <w:spacing w:before="260" w:after="120"/>
+        <w:spacing w:after="120" w:before="260"/>
       </w:pPr>
       <w:r>
         <w:rPr>
@@ -7086,7 +7131,7 @@
     <w:p>
       <w:pPr>
         <w:pStyle w:val="Heading1"/>
-        <w:spacing w:before="320" w:after="160"/>
+        <w:spacing w:after="160" w:before="320"/>
       </w:pPr>
       <w:r>
         <w:rPr>
@@ -7175,7 +7220,7 @@
     <w:p>
       <w:pPr>
         <w:pStyle w:val="Heading1"/>
-        <w:spacing w:before="320" w:after="160"/>
+        <w:spacing w:after="160" w:before="320"/>
       </w:pPr>
       <w:r>
         <w:rPr>
@@ -8441,6 +8486,43 @@
 <w:comments xmlns:cx="http://schemas.microsoft.com/office/drawing/2014/chartex" xmlns:cx1="http://schemas.microsoft.com/office/drawing/2015/9/8/chartex" xmlns:cx2="http://schemas.microsoft.com/office/drawing/2015/10/21/chartex" xmlns:cx3="http://schemas.microsoft.com/office/drawing/2016/5/9/chartex" xmlns:cx4="http://schemas.microsoft.com/office/drawing/2016/5/10/chartex" xmlns:cx5="http://schemas.microsoft.com/office/drawing/2016/5/11/chartex" xmlns:cx6="http://schemas.microsoft.com/office/drawing/2016/5/12/chartex" xmlns:cx7="http://schemas.microsoft.com/office/drawing/2016/5/13/chartex" xmlns:cx8="http://schemas.microsoft.com/office/drawing/2016/5/14/chartex" xmlns:mc="http://schemas.openxmlformats.org/markup-compatibility/2006" xmlns:aink="http://schemas.microsoft.com/office/drawing/2016/ink" xmlns:am3d="http://schemas.microsoft.com/office/drawing/2017/model3d" xmlns:o="urn:schemas-microsoft-com:office:office" xmlns:r="http://schemas.openxmlformats.org/officeDocument/2006/relationships" xmlns:m="http://schemas.openxmlformats.org/officeDocument/2006/math" xmlns:v="urn:schemas-microsoft-com:vml" xmlns:wp14="http://schemas.microsoft.com/office/word/2010/wordprocessingDrawing" xmlns:wp="http://schemas.openxmlformats.org/drawingml/2006/wordprocessingDrawing" xmlns:w10="urn:schemas-microsoft-com:office:word" xmlns:w="http://schemas.openxmlformats.org/wordprocessingml/2006/main" xmlns:w14="http://schemas.microsoft.com/office/word/2010/wordml" xmlns:w15="http://schemas.microsoft.com/office/word/2012/wordml" xmlns:w16cex="http://schemas.microsoft.com/office/word/2018/wordml/cex" xmlns:w16cid="http://schemas.microsoft.com/office/word/2016/wordml/cid" xmlns:w16="http://schemas.microsoft.com/office/word/2018/wordml" xmlns:w16sdtdh="http://schemas.microsoft.com/office/word/2020/wordml/sdtdatahash" xmlns:w16se="http://schemas.microsoft.com/office/word/2015/wordml/symex" xmlns:wpg="http://schemas.microsoft.com/office/word/2010/wordprocessingGroup" xmlns:wpi="http://schemas.microsoft.com/office/word/2010/wordprocessingInk" xmlns:wne="http://schemas.microsoft.com/office/word/2006/wordml" xmlns:wps="http://schemas.microsoft.com/office/word/2010/wordprocessingShape"/>
 </file>
 
+<file path=word/endnotes.xml><?xml version="1.0" encoding="utf-8"?>
+<w:endnotes xmlns:wpc="http://schemas.microsoft.com/office/word/2010/wordprocessingCanvas" xmlns:mc="http://schemas.openxmlformats.org/markup-compatibility/2006" xmlns:o="urn:schemas-microsoft-com:office:office" xmlns:r="http://schemas.openxmlformats.org/officeDocument/2006/relationships" xmlns:m="http://schemas.openxmlformats.org/officeDocument/2006/math" xmlns:v="urn:schemas-microsoft-com:vml" xmlns:wp14="http://schemas.microsoft.com/office/word/2010/wordprocessingDrawing" xmlns:wp="http://schemas.openxmlformats.org/drawingml/2006/wordprocessingDrawing" xmlns:w10="urn:schemas-microsoft-com:office:word" xmlns:w="http://schemas.openxmlformats.org/wordprocessingml/2006/main" xmlns:w14="http://schemas.microsoft.com/office/word/2010/wordml" xmlns:w15="http://schemas.microsoft.com/office/word/2012/wordml" xmlns:wpg="http://schemas.microsoft.com/office/word/2010/wordprocessingGroup" xmlns:wpi="http://schemas.microsoft.com/office/word/2010/wordprocessingInk" xmlns:wne="http://schemas.microsoft.com/office/word/2006/wordml" xmlns:wps="http://schemas.microsoft.com/office/word/2010/wordprocessingShape" mc:Ignorable="w14 w15 wp14">
+  <w:endnote w:type="separator" w:id="-1">
+    <w:p>
+      <w:pPr>
+        <w:spacing w:after="0" w:line="240" w:lineRule="auto"/>
+      </w:pPr>
+      <w:r>
+        <w:rPr>
+          <w:rStyle w:val="EndnoteReference"/>
+        </w:rPr>
+        <w:endnoteRef/>
+      </w:r>
+      <w:r>
+        <w:separator/>
+      </w:r>
+    </w:p>
+  </w:endnote>
+  <w:endnote w:type="continuationSeparator" w:id="0">
+    <w:p>
+      <w:pPr>
+        <w:spacing w:after="0" w:line="240" w:lineRule="auto"/>
+      </w:pPr>
+      <w:r>
+        <w:rPr>
+          <w:rStyle w:val="EndnoteReference"/>
+        </w:rPr>
+        <w:endnoteRef/>
+      </w:r>
+      <w:r>
+        <w:continuationSeparator/>
+      </w:r>
+    </w:p>
+  </w:endnote>
+</w:endnotes>
+</file>
+
 <file path=word/footnotes.xml><?xml version="1.0" encoding="utf-8"?>
 <w:footnotes xmlns:wpc="http://schemas.microsoft.com/office/word/2010/wordprocessingCanvas" xmlns:mc="http://schemas.openxmlformats.org/markup-compatibility/2006" xmlns:o="urn:schemas-microsoft-com:office:office" xmlns:r="http://schemas.openxmlformats.org/officeDocument/2006/relationships" xmlns:m="http://schemas.openxmlformats.org/officeDocument/2006/math" xmlns:v="urn:schemas-microsoft-com:vml" xmlns:wp14="http://schemas.microsoft.com/office/word/2010/wordprocessingDrawing" xmlns:wp="http://schemas.openxmlformats.org/drawingml/2006/wordprocessingDrawing" xmlns:w10="urn:schemas-microsoft-com:office:word" xmlns:w="http://schemas.openxmlformats.org/wordprocessingml/2006/main" xmlns:w14="http://schemas.microsoft.com/office/word/2010/wordml" xmlns:w15="http://schemas.microsoft.com/office/word/2012/wordml" xmlns:wpg="http://schemas.microsoft.com/office/word/2010/wordprocessingGroup" xmlns:wpi="http://schemas.microsoft.com/office/word/2010/wordprocessingInk" xmlns:wne="http://schemas.microsoft.com/office/word/2006/wordml" xmlns:wps="http://schemas.microsoft.com/office/word/2010/wordprocessingShape" mc:Ignorable="w14 w15 wp14">
   <w:footnote w:type="separator" w:id="-1">
@@ -8578,9 +8660,9 @@
   <w:docDefaults>
     <w:rPrDefault>
       <w:rPr>
+        <w:rFonts w:ascii="Calibri" w:cs="Calibri" w:eastAsia="Calibri" w:hAnsi="Calibri"/>
         <w:sz w:val="21"/>
         <w:szCs w:val="21"/>
-        <w:rFonts w:ascii="Calibri" w:cs="Calibri" w:eastAsia="Calibri" w:hAnsi="Calibri"/>
       </w:rPr>
     </w:rPrDefault>
     <w:pPrDefault/>
@@ -8678,8 +8760,8 @@
     <w:uiPriority w:val="99"/>
     <w:unhideWhenUsed/>
     <w:rPr>
+      <w:color w:val="0563C1"/>
       <w:u w:val="single"/>
-      <w:color w:val="0563C1"/>
     </w:rPr>
   </w:style>
   <w:style w:type="character" w:styleId="FootnoteReference">
@@ -8719,5 +8801,42 @@
       <w:szCs w:val="20"/>
     </w:rPr>
   </w:style>
+  <w:style w:type="character" w:styleId="EndnoteReference">
+    <w:name w:val="endnote reference"/>
+    <w:basedOn w:val="DefaultParagraphFont"/>
+    <w:uiPriority w:val="99"/>
+    <w:semiHidden/>
+    <w:unhideWhenUsed/>
+    <w:rPr>
+      <w:vertAlign w:val="superscript"/>
+    </w:rPr>
+  </w:style>
+  <w:style w:type="paragraph" w:styleId="EndnoteText">
+    <w:name w:val="endnote text"/>
+    <w:basedOn w:val="Normal"/>
+    <w:link w:val="EndnoteTextChar"/>
+    <w:uiPriority w:val="99"/>
+    <w:semiHidden/>
+    <w:unhideWhenUsed/>
+    <w:pPr>
+      <w:spacing w:after="0" w:line="240" w:lineRule="auto"/>
+    </w:pPr>
+    <w:rPr>
+      <w:sz w:val="20"/>
+      <w:szCs w:val="20"/>
+    </w:rPr>
+  </w:style>
+  <w:style w:type="character" w:styleId="EndnoteTextChar">
+    <w:name w:val="Endnote Text Char"/>
+    <w:basedOn w:val="DefaultParagraphFont"/>
+    <w:link w:val="EndnoteText"/>
+    <w:uiPriority w:val="99"/>
+    <w:semiHidden/>
+    <w:unhideWhenUsed/>
+    <w:rPr>
+      <w:sz w:val="20"/>
+      <w:szCs w:val="20"/>
+    </w:rPr>
+  </w:style>
 </w:styles>
 </file>
</xml_diff>